<commit_message>
chore(LVA-090): record unit-level re-verification, honest device-level gap
Confirmed the "select all" auth-provider-filtering fix (Issue #9)
still works via a fresh, non-cached unit test run
(OnboardingViewModelVideoFixesTest, 2026-08-12T21:07). Existing
device-level Challenge66 RED/GREEN evidence from 2026-06-26 is honestly
48 days / ~7 versions stale per §6.AK -- the device gate was occupied
by a parallel LVA-087 verification agent this cycle and could not be
re-run. Status stays In progress (not closed) until that re-run
happens -- unit-level confidence is not device-level proof.

Classification: project-specific
</commit_message>
<xml_diff>
--- a/docs/Issues.docx
+++ b/docs/Issues.docx
@@ -896,7 +896,19 @@
         <w:pStyle w:val="BodyText"/>
       </w:pPr>
       <w:r>
-        <w:t xml:space="preserve">QA video frames 0020-0025. NEW UX, contributes to #1. CODE-FIX in 1076 (#9 select-all handling). Pending §6.Z verification. Source: .lava-ci-evidence/video-analysis/2026-06-25-lava-issues-video.md #9.</w:t>
+        <w:t xml:space="preserve">QA video frames 0020-0025. NEW UX, contributes to #1. CODE-FIX in 1076 (#9 select-all handling): OnboardingViewModel.onToggleAllProviders() + requiresNoCredentials() correctly gate select-all to no-auth-only providers, cited to Issue #9 in-source. UNIT-LEVEL RE-VERIFIED 2026-08-12 (this cycle): OnboardingViewModelVideoFixesTest</w:t>
+      </w:r>
+      <w:r>
+        <w:t xml:space="preserve"> </w:t>
+      </w:r>
+      <w:r>
+        <w:t xml:space="preserve">‘select all enables only no-credential providers’</w:t>
+      </w:r>
+      <w:r>
+        <w:t xml:space="preserve"> </w:t>
+      </w:r>
+      <w:r>
+        <w:t xml:space="preserve">PASS, fresh execution (timestamp 2026-08-12T21:07, not cached). Existing DEVICE-LEVEL evidence at .lava-ci-evidence/genymotion/c66-redesign-{RED,GREEN}-20260626/ (proper RED-then-GREEN falsifiability pair, Challenge66SelectAllDoesNotEnableAuthProvidersTest) is 48 days / ~7 versions stale per SS6.AK – device gate was occupied by a parallel LVA-087 verification agent this cycle, could not re-run. Source: .lava-ci-evidence/video-analysis/2026-06-25-lava-issues-video.md #9.</w:t>
       </w:r>
     </w:p>
     <w:bookmarkEnd w:id="16"/>

</xml_diff>